<commit_message>
Part 4 css xpath locators
</commit_message>
<xml_diff>
--- a/Notes.docx
+++ b/Notes.docx
@@ -269,6 +269,7 @@
         </w:rPr>
         <w:t>).</w:t>
       </w:r>
+      <w:proofErr w:type="spellStart"/>
       <w:r>
         <w:rPr>
           <w:rFonts w:ascii="Consolas" w:eastAsia="Times New Roman" w:hAnsi="Consolas" w:cs="Times New Roman"/>
@@ -302,6 +303,7 @@
         </w:rPr>
         <w:t>equal</w:t>
       </w:r>
+      <w:proofErr w:type="spellEnd"/>
       <w:r>
         <w:rPr>
           <w:rFonts w:ascii="Consolas" w:eastAsia="Times New Roman" w:hAnsi="Consolas" w:cs="Times New Roman"/>
@@ -520,6 +522,7 @@
         </w:rPr>
         <w:t>).</w:t>
       </w:r>
+      <w:proofErr w:type="spellStart"/>
       <w:r>
         <w:rPr>
           <w:rFonts w:ascii="Consolas" w:eastAsia="Times New Roman" w:hAnsi="Consolas" w:cs="Times New Roman"/>
@@ -553,6 +556,7 @@
         </w:rPr>
         <w:t>equal</w:t>
       </w:r>
+      <w:proofErr w:type="spellEnd"/>
       <w:r>
         <w:rPr>
           <w:rFonts w:ascii="Consolas" w:eastAsia="Times New Roman" w:hAnsi="Consolas" w:cs="Times New Roman"/>
@@ -901,6 +905,7 @@
         </w:rPr>
         <w:t>).</w:t>
       </w:r>
+      <w:proofErr w:type="spellStart"/>
       <w:r>
         <w:rPr>
           <w:rFonts w:ascii="Consolas" w:eastAsia="Times New Roman" w:hAnsi="Consolas" w:cs="Times New Roman"/>
@@ -934,6 +939,7 @@
         </w:rPr>
         <w:t>equal</w:t>
       </w:r>
+      <w:proofErr w:type="spellEnd"/>
       <w:r>
         <w:rPr>
           <w:rFonts w:ascii="Consolas" w:eastAsia="Times New Roman" w:hAnsi="Consolas" w:cs="Times New Roman"/>
@@ -1040,7 +1046,15 @@
     </w:p>
     <w:p>
       <w:r>
-        <w:t>Method 1:  npx cypress open</w:t>
+        <w:t xml:space="preserve">Method 1:  </w:t>
+      </w:r>
+      <w:proofErr w:type="spellStart"/>
+      <w:r>
+        <w:t>npx</w:t>
+      </w:r>
+      <w:proofErr w:type="spellEnd"/>
+      <w:r>
+        <w:t xml:space="preserve"> cypress open</w:t>
       </w:r>
     </w:p>
     <w:p>
@@ -1055,8 +1069,13 @@
       </w:r>
     </w:p>
     <w:p>
-      <w:r>
-        <w:t xml:space="preserve">npx cypress run     </w:t>
+      <w:proofErr w:type="spellStart"/>
+      <w:r>
+        <w:t>npx</w:t>
+      </w:r>
+      <w:proofErr w:type="spellEnd"/>
+      <w:r>
+        <w:t xml:space="preserve"> cypress run     </w:t>
       </w:r>
       <w:r>
         <w:sym w:font="Wingdings" w:char="F0E0"/>
@@ -1072,112 +1091,535 @@
       </w:r>
     </w:p>
     <w:p>
-      <w:r>
-        <w:t xml:space="preserve">npx cypress run </w:t>
-      </w:r>
-      <w:r>
-        <w:t>--headed</w:t>
-      </w:r>
+      <w:proofErr w:type="spellStart"/>
+      <w:r>
+        <w:t>npx</w:t>
+      </w:r>
+      <w:proofErr w:type="spellEnd"/>
+      <w:r>
+        <w:t xml:space="preserve"> cypress run --headed    </w:t>
+      </w:r>
+      <w:r>
+        <w:sym w:font="Wingdings" w:char="F0E0"/>
+      </w:r>
+      <w:r>
+        <w:t xml:space="preserve"> This will execute all your e2e test files in headed mode (we can see UI also)</w:t>
+      </w:r>
+    </w:p>
+    <w:p>
+      <w:proofErr w:type="spellStart"/>
+      <w:r>
+        <w:t>npx</w:t>
+      </w:r>
+      <w:proofErr w:type="spellEnd"/>
+      <w:r>
+        <w:t xml:space="preserve"> cypress run   --spec </w:t>
+      </w:r>
+      <w:r>
+        <w:t>cypress\e2e\my-first-test.cy.js</w:t>
+      </w:r>
+      <w:r>
+        <w:t xml:space="preserve">  </w:t>
+      </w:r>
+      <w:r>
+        <w:sym w:font="Wingdings" w:char="F0E0"/>
+      </w:r>
+      <w:r>
+        <w:t xml:space="preserve"> This will execute my-first-test file tests only inside e2e.</w:t>
+      </w:r>
+    </w:p>
+    <w:p>
+      <w:r>
+        <w:t xml:space="preserve">                                                                                                         Pass relative pass of test file</w:t>
+      </w:r>
+    </w:p>
+    <w:p>
+      <w:proofErr w:type="spellStart"/>
+      <w:r>
+        <w:t>npx</w:t>
+      </w:r>
+      <w:proofErr w:type="spellEnd"/>
+      <w:r>
+        <w:t xml:space="preserve"> cypress run --browser chrome </w:t>
+      </w:r>
+      <w:r>
+        <w:sym w:font="Wingdings" w:char="F0E0"/>
+      </w:r>
+      <w:r>
+        <w:t xml:space="preserve"> This will execute tests in chrome browser because cypress by default runs in electron browser</w:t>
+      </w:r>
+    </w:p>
+    <w:p/>
+    <w:p>
+      <w:r>
+        <w:t>Spec file(cy.js) ---- &gt; describe bocks</w:t>
+      </w:r>
+      <w:r>
+        <w:t xml:space="preserve"> </w:t>
+      </w:r>
+      <w:r>
+        <w:t>(test suites) ---- &gt; it blocks</w:t>
+      </w:r>
+      <w:r>
+        <w:t xml:space="preserve"> </w:t>
+      </w:r>
+      <w:r>
+        <w:t>(test case)</w:t>
+      </w:r>
+    </w:p>
+    <w:p/>
+    <w:p>
+      <w:pPr>
+        <w:rPr>
+          <w:b/>
+          <w:bCs/>
+          <w:color w:val="538135" w:themeColor="accent6" w:themeShade="BF"/>
+        </w:rPr>
+      </w:pPr>
+      <w:r>
+        <w:rPr>
+          <w:b/>
+          <w:bCs/>
+          <w:color w:val="538135" w:themeColor="accent6" w:themeShade="BF"/>
+        </w:rPr>
+        <w:t xml:space="preserve">Part 4: </w:t>
+      </w:r>
+      <w:r>
+        <w:rPr>
+          <w:b/>
+          <w:bCs/>
+          <w:color w:val="538135" w:themeColor="accent6" w:themeShade="BF"/>
+        </w:rPr>
+        <w:t xml:space="preserve">CSS &amp; XPath Locators | get() &amp; </w:t>
+      </w:r>
+      <w:proofErr w:type="spellStart"/>
+      <w:r>
+        <w:rPr>
+          <w:b/>
+          <w:bCs/>
+          <w:color w:val="538135" w:themeColor="accent6" w:themeShade="BF"/>
+        </w:rPr>
+        <w:t>xpath</w:t>
+      </w:r>
+      <w:proofErr w:type="spellEnd"/>
+      <w:r>
+        <w:rPr>
+          <w:b/>
+          <w:bCs/>
+          <w:color w:val="538135" w:themeColor="accent6" w:themeShade="BF"/>
+        </w:rPr>
+        <w:t>() methods</w:t>
+      </w:r>
+    </w:p>
+    <w:p>
+      <w:r>
+        <w:rPr>
+          <w:b/>
+          <w:bCs/>
+        </w:rPr>
+        <w:t>Locators:</w:t>
+      </w:r>
+      <w:r>
+        <w:t xml:space="preserve"> cypress </w:t>
+      </w:r>
+      <w:r>
+        <w:t xml:space="preserve">by default </w:t>
+      </w:r>
+      <w:r>
+        <w:t xml:space="preserve">supports </w:t>
+      </w:r>
+      <w:proofErr w:type="spellStart"/>
+      <w:r>
+        <w:t>css</w:t>
+      </w:r>
+      <w:proofErr w:type="spellEnd"/>
+      <w:r>
+        <w:t xml:space="preserve"> selectors locator. It also supports XPath selector but requires additional plugin installation.</w:t>
+      </w:r>
+    </w:p>
+    <w:p>
+      <w:r>
+        <w:t>CSS Selector</w:t>
+      </w:r>
+    </w:p>
+    <w:p>
+      <w:proofErr w:type="spellStart"/>
+      <w:r>
+        <w:t>Xpath</w:t>
+      </w:r>
+      <w:proofErr w:type="spellEnd"/>
+      <w:r>
+        <w:t xml:space="preserve"> Selector</w:t>
+      </w:r>
+    </w:p>
+    <w:p>
+      <w:proofErr w:type="spellStart"/>
+      <w:r>
+        <w:t>c</w:t>
+      </w:r>
+      <w:r>
+        <w:t>y.get</w:t>
+      </w:r>
+      <w:proofErr w:type="spellEnd"/>
+      <w:r>
+        <w:t>(</w:t>
+      </w:r>
+      <w:r>
+        <w:t xml:space="preserve">CSS </w:t>
+      </w:r>
+      <w:r>
+        <w:t>Locator)</w:t>
+      </w:r>
+    </w:p>
+    <w:p>
+      <w:proofErr w:type="spellStart"/>
+      <w:r>
+        <w:t>c</w:t>
+      </w:r>
+      <w:r>
+        <w:t>y.</w:t>
+      </w:r>
+      <w:r>
+        <w:t>xpath</w:t>
+      </w:r>
+      <w:proofErr w:type="spellEnd"/>
+      <w:r>
+        <w:t>(</w:t>
+      </w:r>
+      <w:proofErr w:type="spellStart"/>
+      <w:r>
+        <w:t>xpath</w:t>
+      </w:r>
+      <w:proofErr w:type="spellEnd"/>
+      <w:r>
+        <w:t xml:space="preserve"> Locator)</w:t>
+      </w:r>
+    </w:p>
+    <w:p/>
+    <w:p/>
+    <w:p>
+      <w:pPr>
+        <w:rPr>
+          <w:b/>
+          <w:bCs/>
+        </w:rPr>
+      </w:pPr>
+      <w:r>
+        <w:rPr>
+          <w:b/>
+          <w:bCs/>
+        </w:rPr>
+        <w:t xml:space="preserve">CSS Selector: </w:t>
+      </w:r>
+    </w:p>
+    <w:p>
+      <w:r>
+        <w:t xml:space="preserve">Below </w:t>
+      </w:r>
+      <w:r>
+        <w:t>is</w:t>
+      </w:r>
+      <w:r>
+        <w:t xml:space="preserve"> list of </w:t>
+      </w:r>
+      <w:proofErr w:type="spellStart"/>
+      <w:r>
+        <w:t>css</w:t>
+      </w:r>
+      <w:proofErr w:type="spellEnd"/>
+      <w:r>
+        <w:t xml:space="preserve"> selectors combination</w:t>
+      </w:r>
+    </w:p>
+    <w:p>
+      <w:r>
+        <w:t>Tag + id</w:t>
+      </w:r>
+    </w:p>
+    <w:p>
+      <w:r>
+        <w:t>Tag + class</w:t>
+      </w:r>
+    </w:p>
+    <w:p>
+      <w:r>
+        <w:t>Tag + attribute</w:t>
+      </w:r>
+    </w:p>
+    <w:p>
+      <w:r>
+        <w:t>Tag + class + attribute</w:t>
+      </w:r>
+    </w:p>
+    <w:p>
+      <w:r>
+        <w:t>Tag is optional in all combinations.</w:t>
+      </w:r>
+    </w:p>
+    <w:p/>
+    <w:p>
+      <w:r>
+        <w:t>Syntax:</w:t>
+      </w:r>
+    </w:p>
+    <w:p>
+      <w:proofErr w:type="spellStart"/>
+      <w:r>
+        <w:t>tag</w:t>
+      </w:r>
+      <w:r>
+        <w:t>#id</w:t>
+      </w:r>
+      <w:proofErr w:type="spellEnd"/>
+    </w:p>
+    <w:p>
+      <w:proofErr w:type="spellStart"/>
+      <w:r>
+        <w:t>tag</w:t>
+      </w:r>
+      <w:r>
+        <w:t>.class</w:t>
+      </w:r>
+      <w:proofErr w:type="spellEnd"/>
+    </w:p>
+    <w:p>
+      <w:r>
+        <w:t>tag</w:t>
+      </w:r>
+      <w:r>
+        <w:t>[attribute=”value”]</w:t>
+      </w:r>
+    </w:p>
+    <w:p>
+      <w:proofErr w:type="spellStart"/>
+      <w:r>
+        <w:t>tag</w:t>
+      </w:r>
+      <w:r>
+        <w:t>.class</w:t>
+      </w:r>
+      <w:proofErr w:type="spellEnd"/>
+      <w:r>
+        <w:t>[attribute</w:t>
+      </w:r>
+      <w:r>
+        <w:t xml:space="preserve"> </w:t>
+      </w:r>
+      <w:r>
+        <w:t>=</w:t>
+      </w:r>
+      <w:r>
+        <w:t>”</w:t>
+      </w:r>
+      <w:r>
+        <w:t>value</w:t>
+      </w:r>
+      <w:r>
+        <w:t>”</w:t>
+      </w:r>
+      <w:r>
+        <w:t>]</w:t>
+      </w:r>
+    </w:p>
+    <w:p/>
+    <w:p>
+      <w:r>
+        <w:t xml:space="preserve">Add /// </w:t>
+      </w:r>
+      <w:r>
+        <w:t>&lt;reference types="</w:t>
+      </w:r>
+      <w:r>
+        <w:t>c</w:t>
+      </w:r>
+      <w:r>
+        <w:t>ypress" /&gt;</w:t>
+      </w:r>
+      <w:r>
+        <w:t xml:space="preserve"> in commands.js file to access all methods and properties of cy. After this “</w:t>
+      </w:r>
+      <w:r>
+        <w:t>const cypress = require("cypress");</w:t>
+      </w:r>
+      <w:r>
+        <w:t xml:space="preserve"> “</w:t>
+      </w:r>
+      <w:r>
+        <w:t xml:space="preserve"> </w:t>
+      </w:r>
+      <w:r>
+        <w:t xml:space="preserve"> import is not needed in all files.</w:t>
+      </w:r>
+    </w:p>
+    <w:p/>
+    <w:p>
+      <w:pPr>
+        <w:rPr>
+          <w:b/>
+          <w:bCs/>
+        </w:rPr>
+      </w:pPr>
+      <w:r>
+        <w:rPr>
+          <w:b/>
+          <w:bCs/>
+        </w:rPr>
+        <w:t xml:space="preserve">XPath: </w:t>
+      </w:r>
+    </w:p>
+    <w:p>
+      <w:proofErr w:type="spellStart"/>
+      <w:r>
+        <w:t>npm</w:t>
+      </w:r>
+      <w:proofErr w:type="spellEnd"/>
+      <w:r>
+        <w:t xml:space="preserve"> install -D cypress-</w:t>
+      </w:r>
+      <w:proofErr w:type="spellStart"/>
+      <w:r>
+        <w:t>xpath</w:t>
+      </w:r>
+      <w:proofErr w:type="spellEnd"/>
+    </w:p>
+    <w:p>
+      <w:r>
+        <w:t>Add</w:t>
+      </w:r>
+      <w:r>
+        <w:t xml:space="preserve"> entry</w:t>
+      </w:r>
+      <w:r>
+        <w:t xml:space="preserve"> </w:t>
+      </w:r>
+      <w:r>
+        <w:t xml:space="preserve">in commands.js file to access </w:t>
+      </w:r>
+      <w:proofErr w:type="spellStart"/>
+      <w:r>
+        <w:t>xpath</w:t>
+      </w:r>
+      <w:proofErr w:type="spellEnd"/>
+      <w:r>
+        <w:t xml:space="preserve"> methods.</w:t>
+      </w:r>
+    </w:p>
+    <w:p>
       <w:r>
         <w:t xml:space="preserve">    </w:t>
       </w:r>
       <w:r>
-        <w:sym w:font="Wingdings" w:char="F0E0"/>
-      </w:r>
-      <w:r>
-        <w:t xml:space="preserve"> This will execute all your e2e test files in head</w:t>
-      </w:r>
-      <w:r>
-        <w:t>ed</w:t>
-      </w:r>
-      <w:r>
-        <w:t xml:space="preserve"> mode</w:t>
+        <w:t xml:space="preserve">/// </w:t>
+      </w:r>
+      <w:r>
+        <w:t>&lt;reference types="</w:t>
+      </w:r>
+      <w:r>
+        <w:t>c</w:t>
+      </w:r>
+      <w:r>
+        <w:t>ypress</w:t>
+      </w:r>
+      <w:r>
+        <w:t>-</w:t>
+      </w:r>
+      <w:proofErr w:type="spellStart"/>
+      <w:r>
+        <w:t>xpath</w:t>
+      </w:r>
+      <w:proofErr w:type="spellEnd"/>
+      <w:r>
+        <w:t>" /&gt;</w:t>
       </w:r>
       <w:r>
         <w:t xml:space="preserve"> </w:t>
       </w:r>
-      <w:r>
-        <w:t>(we can see UI</w:t>
-      </w:r>
-      <w:r>
-        <w:t xml:space="preserve"> also</w:t>
-      </w:r>
-      <w:r>
-        <w:t>)</w:t>
-      </w:r>
-    </w:p>
-    <w:p>
-      <w:r>
-        <w:t xml:space="preserve">npx cypress run   </w:t>
-      </w:r>
-      <w:r>
-        <w:t xml:space="preserve">--spec </w:t>
-      </w:r>
-      <w:r>
-        <w:t>cypress\e2e\my-first-test.cy.js</w:t>
+    </w:p>
+    <w:p/>
+    <w:p>
+      <w:r>
+        <w:t xml:space="preserve">Add </w:t>
+      </w:r>
+      <w:r>
+        <w:t xml:space="preserve">entry </w:t>
+      </w:r>
+      <w:r>
+        <w:t xml:space="preserve">“ in e2e.js file </w:t>
+      </w:r>
+      <w:proofErr w:type="spellStart"/>
+      <w:r>
+        <w:t>iside</w:t>
+      </w:r>
+      <w:proofErr w:type="spellEnd"/>
+      <w:r>
+        <w:t xml:space="preserve"> supports folder.</w:t>
       </w:r>
       <w:r>
         <w:t xml:space="preserve">  </w:t>
       </w:r>
-      <w:r>
-        <w:sym w:font="Wingdings" w:char="F0E0"/>
-      </w:r>
-      <w:r>
-        <w:t xml:space="preserve"> This will execute </w:t>
-      </w:r>
-      <w:r>
-        <w:t>my-first-test</w:t>
-      </w:r>
-      <w:r>
-        <w:t xml:space="preserve"> file</w:t>
-      </w:r>
-      <w:r>
-        <w:t xml:space="preserve"> tests only</w:t>
+    </w:p>
+    <w:p>
+      <w:r>
+        <w:t xml:space="preserve">    </w:t>
+      </w:r>
+      <w:r>
+        <w:t>require('cypress-</w:t>
+      </w:r>
+      <w:proofErr w:type="spellStart"/>
+      <w:r>
+        <w:t>xpath</w:t>
+      </w:r>
+      <w:proofErr w:type="spellEnd"/>
+      <w:r>
+        <w:t>');</w:t>
       </w:r>
       <w:r>
         <w:t xml:space="preserve"> </w:t>
       </w:r>
-      <w:r>
-        <w:t>inside e2e.</w:t>
-      </w:r>
-    </w:p>
-    <w:p>
-      <w:r>
-        <w:t xml:space="preserve">                                                                                                         Pass relative pass of test file</w:t>
-      </w:r>
-    </w:p>
-    <w:p>
-      <w:r>
-        <w:t>npx cypress run</w:t>
-      </w:r>
-      <w:r>
-        <w:t xml:space="preserve"> --browser chrome </w:t>
-      </w:r>
-      <w:r>
-        <w:sym w:font="Wingdings" w:char="F0E0"/>
-      </w:r>
-      <w:r>
-        <w:t xml:space="preserve"> This will execute tests in chrome browser because cypress by default runs in electron browser</w:t>
-      </w:r>
     </w:p>
     <w:p/>
     <w:p>
-      <w:r>
-        <w:t>Spec file(cy.js) ---- &gt; describe bocks</w:t>
-      </w:r>
-      <w:r>
-        <w:t xml:space="preserve"> </w:t>
-      </w:r>
-      <w:r>
-        <w:t>(test suites) ---- &gt; it blocks</w:t>
-      </w:r>
-      <w:r>
-        <w:t xml:space="preserve"> </w:t>
-      </w:r>
-      <w:r>
-        <w:t>(test case)</w:t>
-      </w:r>
-    </w:p>
+      <w:pPr>
+        <w:rPr>
+          <w:b/>
+          <w:bCs/>
+          <w:color w:val="538135" w:themeColor="accent6" w:themeShade="BF"/>
+        </w:rPr>
+      </w:pPr>
+      <w:r>
+        <w:rPr>
+          <w:b/>
+          <w:bCs/>
+          <w:color w:val="538135" w:themeColor="accent6" w:themeShade="BF"/>
+        </w:rPr>
+        <w:t xml:space="preserve">Part </w:t>
+      </w:r>
+      <w:r>
+        <w:rPr>
+          <w:b/>
+          <w:bCs/>
+          <w:color w:val="538135" w:themeColor="accent6" w:themeShade="BF"/>
+        </w:rPr>
+        <w:t>5: Assertions</w:t>
+      </w:r>
+    </w:p>
+    <w:p>
+      <w:pPr>
+        <w:rPr>
+          <w:b/>
+          <w:bCs/>
+          <w:color w:val="538135" w:themeColor="accent6" w:themeShade="BF"/>
+        </w:rPr>
+      </w:pPr>
+    </w:p>
+    <w:p/>
+    <w:p/>
+    <w:p/>
+    <w:p/>
+    <w:p/>
+    <w:p/>
+    <w:p/>
+    <w:p/>
     <w:p/>
     <w:p/>
     <w:p/>

</xml_diff>

<commit_message>
Part-6: Folder Structure | IntelliSense Auto Suggestions
</commit_message>
<xml_diff>
--- a/Notes.docx
+++ b/Notes.docx
@@ -273,6 +273,7 @@
         </w:rPr>
         <w:t>).</w:t>
       </w:r>
+      <w:proofErr w:type="spellStart"/>
       <w:proofErr w:type="gramStart"/>
       <w:r>
         <w:rPr>
@@ -307,6 +308,7 @@
         </w:rPr>
         <w:t>equal</w:t>
       </w:r>
+      <w:proofErr w:type="spellEnd"/>
       <w:proofErr w:type="gramEnd"/>
       <w:r>
         <w:rPr>
@@ -528,6 +530,7 @@
         </w:rPr>
         <w:t>).</w:t>
       </w:r>
+      <w:proofErr w:type="spellStart"/>
       <w:proofErr w:type="gramStart"/>
       <w:r>
         <w:rPr>
@@ -562,6 +565,7 @@
         </w:rPr>
         <w:t>equal</w:t>
       </w:r>
+      <w:proofErr w:type="spellEnd"/>
       <w:proofErr w:type="gramEnd"/>
       <w:r>
         <w:rPr>
@@ -915,6 +919,7 @@
         </w:rPr>
         <w:t>).</w:t>
       </w:r>
+      <w:proofErr w:type="spellStart"/>
       <w:proofErr w:type="gramStart"/>
       <w:r>
         <w:rPr>
@@ -949,6 +954,7 @@
         </w:rPr>
         <w:t>equal</w:t>
       </w:r>
+      <w:proofErr w:type="spellEnd"/>
       <w:proofErr w:type="gramEnd"/>
       <w:r>
         <w:rPr>
@@ -1056,7 +1062,15 @@
     </w:p>
     <w:p>
       <w:r>
-        <w:t>Method 1:  npx cypress open</w:t>
+        <w:t xml:space="preserve">Method 1:  </w:t>
+      </w:r>
+      <w:proofErr w:type="spellStart"/>
+      <w:r>
+        <w:t>npx</w:t>
+      </w:r>
+      <w:proofErr w:type="spellEnd"/>
+      <w:r>
+        <w:t xml:space="preserve"> cypress open</w:t>
       </w:r>
     </w:p>
     <w:p>
@@ -1071,8 +1085,13 @@
       </w:r>
     </w:p>
     <w:p>
-      <w:r>
-        <w:t xml:space="preserve">npx cypress run     </w:t>
+      <w:proofErr w:type="spellStart"/>
+      <w:r>
+        <w:t>npx</w:t>
+      </w:r>
+      <w:proofErr w:type="spellEnd"/>
+      <w:r>
+        <w:t xml:space="preserve"> cypress run     </w:t>
       </w:r>
       <w:r>
         <w:sym w:font="Wingdings" w:char="F0E0"/>
@@ -1088,8 +1107,13 @@
       </w:r>
     </w:p>
     <w:p>
-      <w:r>
-        <w:t xml:space="preserve">npx cypress run --headed    </w:t>
+      <w:proofErr w:type="spellStart"/>
+      <w:r>
+        <w:t>npx</w:t>
+      </w:r>
+      <w:proofErr w:type="spellEnd"/>
+      <w:r>
+        <w:t xml:space="preserve"> cypress run --headed    </w:t>
       </w:r>
       <w:r>
         <w:sym w:font="Wingdings" w:char="F0E0"/>
@@ -1099,8 +1123,13 @@
       </w:r>
     </w:p>
     <w:p>
-      <w:r>
-        <w:t xml:space="preserve">npx cypress run   --spec </w:t>
+      <w:proofErr w:type="spellStart"/>
+      <w:r>
+        <w:t>npx</w:t>
+      </w:r>
+      <w:proofErr w:type="spellEnd"/>
+      <w:r>
+        <w:t xml:space="preserve"> cypress run   --spec </w:t>
       </w:r>
       <w:r>
         <w:t>cypress\e2e\my-first-test.cy.js</w:t>
@@ -1121,8 +1150,13 @@
       </w:r>
     </w:p>
     <w:p>
-      <w:r>
-        <w:t xml:space="preserve">npx cypress run --browser chrome </w:t>
+      <w:proofErr w:type="spellStart"/>
+      <w:r>
+        <w:t>npx</w:t>
+      </w:r>
+      <w:proofErr w:type="spellEnd"/>
+      <w:r>
+        <w:t xml:space="preserve"> cypress run --browser chrome </w:t>
       </w:r>
       <w:r>
         <w:sym w:font="Wingdings" w:char="F0E0"/>
@@ -1182,313 +1216,423 @@
           <w:bCs/>
           <w:color w:val="538135" w:themeColor="accent6" w:themeShade="BF"/>
         </w:rPr>
-        <w:t>) &amp; xpath() methods</w:t>
-      </w:r>
-    </w:p>
-    <w:p>
-      <w:r>
-        <w:rPr>
-          <w:b/>
-          <w:bCs/>
-        </w:rPr>
-        <w:t>Locators:</w:t>
-      </w:r>
-      <w:r>
-        <w:t xml:space="preserve"> cypress </w:t>
-      </w:r>
-      <w:r>
-        <w:t xml:space="preserve">by default </w:t>
-      </w:r>
-      <w:r>
-        <w:t>supports css selectors locator. It also supports XPath selector but requires additional plugin installation.</w:t>
-      </w:r>
-    </w:p>
-    <w:p>
-      <w:r>
-        <w:t>CSS Selector</w:t>
-      </w:r>
-    </w:p>
-    <w:p>
-      <w:r>
-        <w:t>Xpath Selector</w:t>
-      </w:r>
-    </w:p>
-    <w:p>
-      <w:proofErr w:type="gramStart"/>
-      <w:r>
-        <w:t>c</w:t>
-      </w:r>
-      <w:r>
-        <w:t>y.get(</w:t>
-      </w:r>
-      <w:proofErr w:type="gramEnd"/>
-      <w:r>
-        <w:t xml:space="preserve">CSS </w:t>
-      </w:r>
-      <w:r>
-        <w:t>Locator)</w:t>
-      </w:r>
-    </w:p>
-    <w:p>
-      <w:proofErr w:type="gramStart"/>
-      <w:r>
-        <w:t>cy.xpath</w:t>
-      </w:r>
-      <w:proofErr w:type="gramEnd"/>
-      <w:r>
-        <w:t>(xpath Locator)</w:t>
-      </w:r>
-    </w:p>
-    <w:p/>
-    <w:p/>
-    <w:p>
-      <w:pPr>
-        <w:rPr>
-          <w:b/>
-          <w:bCs/>
-        </w:rPr>
-      </w:pPr>
-      <w:r>
-        <w:rPr>
-          <w:b/>
-          <w:bCs/>
-        </w:rPr>
-        <w:t xml:space="preserve">CSS Selector: </w:t>
-      </w:r>
-    </w:p>
-    <w:p>
-      <w:r>
-        <w:t xml:space="preserve">Below </w:t>
-      </w:r>
-      <w:r>
-        <w:t>is</w:t>
-      </w:r>
-      <w:r>
-        <w:t xml:space="preserve"> list of css selectors combination</w:t>
-      </w:r>
-    </w:p>
-    <w:p>
-      <w:r>
-        <w:t>Tag + id</w:t>
-      </w:r>
-    </w:p>
-    <w:p>
-      <w:r>
-        <w:t>Tag + class</w:t>
-      </w:r>
-    </w:p>
-    <w:p>
-      <w:r>
-        <w:t>Tag + attribute</w:t>
-      </w:r>
-    </w:p>
-    <w:p>
-      <w:r>
-        <w:t>Tag + class + attribute</w:t>
-      </w:r>
-    </w:p>
-    <w:p>
-      <w:r>
-        <w:t>Tag is optional in all combinations.</w:t>
-      </w:r>
-    </w:p>
-    <w:p/>
-    <w:p>
-      <w:r>
-        <w:t>Syntax:</w:t>
-      </w:r>
-    </w:p>
-    <w:p>
-      <w:r>
-        <w:t>tag</w:t>
-      </w:r>
-      <w:r>
-        <w:t>#id</w:t>
-      </w:r>
-    </w:p>
-    <w:p>
-      <w:r>
-        <w:t>tag</w:t>
-      </w:r>
-      <w:r>
-        <w:t>.class</w:t>
-      </w:r>
-    </w:p>
-    <w:p>
-      <w:r>
-        <w:t>tag</w:t>
-      </w:r>
-      <w:r>
-        <w:t>[attribute=”value”]</w:t>
-      </w:r>
-    </w:p>
-    <w:p>
-      <w:r>
-        <w:t>tag</w:t>
-      </w:r>
-      <w:r>
-        <w:t>.</w:t>
-      </w:r>
-      <w:proofErr w:type="gramStart"/>
-      <w:r>
-        <w:t>class[</w:t>
-      </w:r>
-      <w:proofErr w:type="gramEnd"/>
-      <w:r>
-        <w:t>attribute =”value”]</w:t>
-      </w:r>
-    </w:p>
-    <w:p/>
-    <w:p>
-      <w:r>
-        <w:t xml:space="preserve">Add /// </w:t>
-      </w:r>
-      <w:r>
-        <w:t>&lt;reference types="</w:t>
-      </w:r>
-      <w:r>
-        <w:t>c</w:t>
-      </w:r>
-      <w:r>
-        <w:t>ypress" /&gt;</w:t>
-      </w:r>
-      <w:r>
-        <w:t xml:space="preserve"> in commands.js file to access all methods and properties of cy. After this “</w:t>
-      </w:r>
-      <w:r>
-        <w:t>const cypress = require("cypress");</w:t>
-      </w:r>
-      <w:r>
-        <w:t xml:space="preserve"> </w:t>
-      </w:r>
-      <w:proofErr w:type="gramStart"/>
-      <w:r>
-        <w:t>“</w:t>
-      </w:r>
-      <w:r>
-        <w:t xml:space="preserve"> </w:t>
-      </w:r>
-      <w:r>
-        <w:t xml:space="preserve"> import</w:t>
-      </w:r>
-      <w:proofErr w:type="gramEnd"/>
-      <w:r>
-        <w:t xml:space="preserve"> is not needed in all files.</w:t>
-      </w:r>
-    </w:p>
-    <w:p/>
-    <w:p>
-      <w:pPr>
-        <w:rPr>
-          <w:b/>
-          <w:bCs/>
-        </w:rPr>
-      </w:pPr>
-      <w:r>
-        <w:rPr>
-          <w:b/>
-          <w:bCs/>
-        </w:rPr>
-        <w:t xml:space="preserve">XPath: </w:t>
-      </w:r>
-    </w:p>
-    <w:p>
-      <w:r>
-        <w:t>npm install -D cypress-xpath</w:t>
-      </w:r>
-    </w:p>
-    <w:p>
-      <w:r>
-        <w:t>Add</w:t>
-      </w:r>
-      <w:r>
-        <w:t xml:space="preserve"> entry</w:t>
-      </w:r>
-      <w:r>
-        <w:t xml:space="preserve"> </w:t>
-      </w:r>
-      <w:r>
-        <w:t>in commands.js file to access xpath methods.</w:t>
-      </w:r>
-    </w:p>
-    <w:p>
-      <w:r>
-        <w:t xml:space="preserve">    </w:t>
-      </w:r>
-      <w:r>
-        <w:t xml:space="preserve">/// </w:t>
-      </w:r>
-      <w:r>
-        <w:t>&lt;reference types="</w:t>
-      </w:r>
-      <w:r>
-        <w:t>c</w:t>
-      </w:r>
-      <w:r>
-        <w:t>ypress</w:t>
-      </w:r>
-      <w:r>
-        <w:t>-xpath</w:t>
-      </w:r>
-      <w:r>
-        <w:t>" /&gt;</w:t>
-      </w:r>
-      <w:r>
-        <w:t xml:space="preserve"> </w:t>
-      </w:r>
-    </w:p>
-    <w:p/>
-    <w:p>
-      <w:r>
-        <w:t xml:space="preserve">Add </w:t>
-      </w:r>
-      <w:r>
-        <w:t xml:space="preserve">entry </w:t>
-      </w:r>
-      <w:proofErr w:type="gramStart"/>
-      <w:r>
-        <w:t>“ in</w:t>
-      </w:r>
-      <w:proofErr w:type="gramEnd"/>
-      <w:r>
-        <w:t xml:space="preserve"> e2e.js file iside supports folder.  </w:t>
-      </w:r>
-    </w:p>
-    <w:p>
-      <w:r>
-        <w:t xml:space="preserve">    </w:t>
-      </w:r>
-      <w:r>
-        <w:t>require('cypress-xpath');</w:t>
-      </w:r>
-      <w:r>
-        <w:t xml:space="preserve"> </w:t>
-      </w:r>
-    </w:p>
-    <w:p/>
-    <w:p>
-      <w:pPr>
+        <w:t xml:space="preserve">) &amp; </w:t>
+      </w:r>
+      <w:proofErr w:type="spellStart"/>
+      <w:r>
         <w:rPr>
           <w:b/>
           <w:bCs/>
           <w:color w:val="538135" w:themeColor="accent6" w:themeShade="BF"/>
         </w:rPr>
-      </w:pPr>
+        <w:t>xpath</w:t>
+      </w:r>
+      <w:proofErr w:type="spellEnd"/>
       <w:r>
         <w:rPr>
           <w:b/>
           <w:bCs/>
           <w:color w:val="538135" w:themeColor="accent6" w:themeShade="BF"/>
         </w:rPr>
-        <w:t xml:space="preserve">Part </w:t>
-      </w:r>
-      <w:r>
+        <w:t>() methods</w:t>
+      </w:r>
+    </w:p>
+    <w:p>
+      <w:r>
+        <w:rPr>
+          <w:b/>
+          <w:bCs/>
+        </w:rPr>
+        <w:t>Locators:</w:t>
+      </w:r>
+      <w:r>
+        <w:t xml:space="preserve"> cypress </w:t>
+      </w:r>
+      <w:r>
+        <w:t xml:space="preserve">by default </w:t>
+      </w:r>
+      <w:r>
+        <w:t xml:space="preserve">supports </w:t>
+      </w:r>
+      <w:proofErr w:type="spellStart"/>
+      <w:r>
+        <w:t>css</w:t>
+      </w:r>
+      <w:proofErr w:type="spellEnd"/>
+      <w:r>
+        <w:t xml:space="preserve"> selectors locator. It also supports XPath selector but requires additional plugin installation.</w:t>
+      </w:r>
+    </w:p>
+    <w:p>
+      <w:r>
+        <w:t>CSS Selector</w:t>
+      </w:r>
+    </w:p>
+    <w:p>
+      <w:proofErr w:type="spellStart"/>
+      <w:r>
+        <w:t>Xpath</w:t>
+      </w:r>
+      <w:proofErr w:type="spellEnd"/>
+      <w:r>
+        <w:t xml:space="preserve"> Selector</w:t>
+      </w:r>
+    </w:p>
+    <w:p>
+      <w:proofErr w:type="spellStart"/>
+      <w:proofErr w:type="gramStart"/>
+      <w:r>
+        <w:t>c</w:t>
+      </w:r>
+      <w:r>
+        <w:t>y.get</w:t>
+      </w:r>
+      <w:proofErr w:type="spellEnd"/>
+      <w:r>
+        <w:t>(</w:t>
+      </w:r>
+      <w:proofErr w:type="gramEnd"/>
+      <w:r>
+        <w:t xml:space="preserve">CSS </w:t>
+      </w:r>
+      <w:r>
+        <w:t>Locator)</w:t>
+      </w:r>
+    </w:p>
+    <w:p>
+      <w:proofErr w:type="spellStart"/>
+      <w:proofErr w:type="gramStart"/>
+      <w:r>
+        <w:t>cy.xpath</w:t>
+      </w:r>
+      <w:proofErr w:type="spellEnd"/>
+      <w:proofErr w:type="gramEnd"/>
+      <w:r>
+        <w:t>(</w:t>
+      </w:r>
+      <w:proofErr w:type="spellStart"/>
+      <w:r>
+        <w:t>xpath</w:t>
+      </w:r>
+      <w:proofErr w:type="spellEnd"/>
+      <w:r>
+        <w:t xml:space="preserve"> Locator)</w:t>
+      </w:r>
+    </w:p>
+    <w:p/>
+    <w:p/>
+    <w:p>
+      <w:pPr>
+        <w:rPr>
+          <w:b/>
+          <w:bCs/>
+        </w:rPr>
+      </w:pPr>
+      <w:r>
+        <w:rPr>
+          <w:b/>
+          <w:bCs/>
+        </w:rPr>
+        <w:t xml:space="preserve">CSS Selector: </w:t>
+      </w:r>
+    </w:p>
+    <w:p>
+      <w:r>
+        <w:t xml:space="preserve">Below </w:t>
+      </w:r>
+      <w:r>
+        <w:t>is</w:t>
+      </w:r>
+      <w:r>
+        <w:t xml:space="preserve"> list of </w:t>
+      </w:r>
+      <w:proofErr w:type="spellStart"/>
+      <w:r>
+        <w:t>css</w:t>
+      </w:r>
+      <w:proofErr w:type="spellEnd"/>
+      <w:r>
+        <w:t xml:space="preserve"> selectors combination</w:t>
+      </w:r>
+    </w:p>
+    <w:p>
+      <w:r>
+        <w:t>Tag + id</w:t>
+      </w:r>
+    </w:p>
+    <w:p>
+      <w:r>
+        <w:t>Tag + class</w:t>
+      </w:r>
+    </w:p>
+    <w:p>
+      <w:r>
+        <w:t>Tag + attribute</w:t>
+      </w:r>
+    </w:p>
+    <w:p>
+      <w:r>
+        <w:t>Tag + class + attribute</w:t>
+      </w:r>
+    </w:p>
+    <w:p>
+      <w:r>
+        <w:t>Tag is optional in all combinations.</w:t>
+      </w:r>
+    </w:p>
+    <w:p/>
+    <w:p>
+      <w:r>
+        <w:t>Syntax:</w:t>
+      </w:r>
+    </w:p>
+    <w:p>
+      <w:proofErr w:type="spellStart"/>
+      <w:r>
+        <w:t>tag</w:t>
+      </w:r>
+      <w:r>
+        <w:t>#id</w:t>
+      </w:r>
+      <w:proofErr w:type="spellEnd"/>
+    </w:p>
+    <w:p>
+      <w:proofErr w:type="spellStart"/>
+      <w:r>
+        <w:t>tag</w:t>
+      </w:r>
+      <w:r>
+        <w:t>.class</w:t>
+      </w:r>
+      <w:proofErr w:type="spellEnd"/>
+    </w:p>
+    <w:p>
+      <w:r>
+        <w:t>tag</w:t>
+      </w:r>
+      <w:r>
+        <w:t>[attribute=”value”]</w:t>
+      </w:r>
+    </w:p>
+    <w:p>
+      <w:proofErr w:type="spellStart"/>
+      <w:r>
+        <w:t>tag</w:t>
+      </w:r>
+      <w:r>
+        <w:t>.</w:t>
+      </w:r>
+      <w:proofErr w:type="gramStart"/>
+      <w:r>
+        <w:t>class</w:t>
+      </w:r>
+      <w:proofErr w:type="spellEnd"/>
+      <w:r>
+        <w:t>[</w:t>
+      </w:r>
+      <w:proofErr w:type="gramEnd"/>
+      <w:r>
+        <w:t>attribute =”value”]</w:t>
+      </w:r>
+    </w:p>
+    <w:p/>
+    <w:p>
+      <w:r>
+        <w:t xml:space="preserve">Add /// </w:t>
+      </w:r>
+      <w:r>
+        <w:t>&lt;reference types="</w:t>
+      </w:r>
+      <w:r>
+        <w:t>c</w:t>
+      </w:r>
+      <w:r>
+        <w:t>ypress" /&gt;</w:t>
+      </w:r>
+      <w:r>
+        <w:t xml:space="preserve"> in commands.js file to access all methods and properties of cy. After this “</w:t>
+      </w:r>
+      <w:r>
+        <w:t>const cypress = require("cypress");</w:t>
+      </w:r>
+      <w:r>
+        <w:t xml:space="preserve"> </w:t>
+      </w:r>
+      <w:proofErr w:type="gramStart"/>
+      <w:r>
+        <w:t>“</w:t>
+      </w:r>
+      <w:r>
+        <w:t xml:space="preserve"> </w:t>
+      </w:r>
+      <w:r>
+        <w:t xml:space="preserve"> import</w:t>
+      </w:r>
+      <w:proofErr w:type="gramEnd"/>
+      <w:r>
+        <w:t xml:space="preserve"> is not needed in all files.</w:t>
+      </w:r>
+    </w:p>
+    <w:p/>
+    <w:p>
+      <w:pPr>
+        <w:rPr>
+          <w:b/>
+          <w:bCs/>
+        </w:rPr>
+      </w:pPr>
+      <w:r>
+        <w:rPr>
+          <w:b/>
+          <w:bCs/>
+        </w:rPr>
+        <w:t xml:space="preserve">XPath: </w:t>
+      </w:r>
+    </w:p>
+    <w:p>
+      <w:proofErr w:type="spellStart"/>
+      <w:r>
+        <w:t>npm</w:t>
+      </w:r>
+      <w:proofErr w:type="spellEnd"/>
+      <w:r>
+        <w:t xml:space="preserve"> install -D cypress-</w:t>
+      </w:r>
+      <w:proofErr w:type="spellStart"/>
+      <w:r>
+        <w:t>xpath</w:t>
+      </w:r>
+      <w:proofErr w:type="spellEnd"/>
+    </w:p>
+    <w:p>
+      <w:r>
+        <w:t>Add</w:t>
+      </w:r>
+      <w:r>
+        <w:t xml:space="preserve"> entry</w:t>
+      </w:r>
+      <w:r>
+        <w:t xml:space="preserve"> </w:t>
+      </w:r>
+      <w:r>
+        <w:t xml:space="preserve">in commands.js file to access </w:t>
+      </w:r>
+      <w:proofErr w:type="spellStart"/>
+      <w:r>
+        <w:t>xpath</w:t>
+      </w:r>
+      <w:proofErr w:type="spellEnd"/>
+      <w:r>
+        <w:t xml:space="preserve"> methods.</w:t>
+      </w:r>
+    </w:p>
+    <w:p>
+      <w:r>
+        <w:t xml:space="preserve">    </w:t>
+      </w:r>
+      <w:r>
+        <w:t xml:space="preserve">/// </w:t>
+      </w:r>
+      <w:r>
+        <w:t>&lt;reference types="</w:t>
+      </w:r>
+      <w:r>
+        <w:t>c</w:t>
+      </w:r>
+      <w:r>
+        <w:t>ypress</w:t>
+      </w:r>
+      <w:r>
+        <w:t>-</w:t>
+      </w:r>
+      <w:proofErr w:type="spellStart"/>
+      <w:r>
+        <w:t>xpath</w:t>
+      </w:r>
+      <w:proofErr w:type="spellEnd"/>
+      <w:r>
+        <w:t>" /&gt;</w:t>
+      </w:r>
+      <w:r>
+        <w:t xml:space="preserve"> </w:t>
+      </w:r>
+    </w:p>
+    <w:p/>
+    <w:p>
+      <w:r>
+        <w:t xml:space="preserve">Add </w:t>
+      </w:r>
+      <w:r>
+        <w:t xml:space="preserve">entry </w:t>
+      </w:r>
+      <w:proofErr w:type="gramStart"/>
+      <w:r>
+        <w:t>“ in</w:t>
+      </w:r>
+      <w:proofErr w:type="gramEnd"/>
+      <w:r>
+        <w:t xml:space="preserve"> e2e.js file </w:t>
+      </w:r>
+      <w:proofErr w:type="spellStart"/>
+      <w:r>
+        <w:t>iside</w:t>
+      </w:r>
+      <w:proofErr w:type="spellEnd"/>
+      <w:r>
+        <w:t xml:space="preserve"> supports folder.  </w:t>
+      </w:r>
+    </w:p>
+    <w:p>
+      <w:r>
+        <w:t xml:space="preserve">    </w:t>
+      </w:r>
+      <w:r>
+        <w:t>require('cypress-</w:t>
+      </w:r>
+      <w:proofErr w:type="spellStart"/>
+      <w:r>
+        <w:t>xpath</w:t>
+      </w:r>
+      <w:proofErr w:type="spellEnd"/>
+      <w:r>
+        <w:t>');</w:t>
+      </w:r>
+      <w:r>
+        <w:t xml:space="preserve"> </w:t>
+      </w:r>
+    </w:p>
+    <w:p/>
+    <w:p>
+      <w:pPr>
         <w:rPr>
           <w:b/>
           <w:bCs/>
           <w:color w:val="538135" w:themeColor="accent6" w:themeShade="BF"/>
         </w:rPr>
-        <w:t>5: Assertions</w:t>
+      </w:pPr>
+      <w:r>
+        <w:rPr>
+          <w:b/>
+          <w:bCs/>
+          <w:color w:val="538135" w:themeColor="accent6" w:themeShade="BF"/>
+        </w:rPr>
+        <w:t xml:space="preserve">Part </w:t>
+      </w:r>
+      <w:r>
+        <w:rPr>
+          <w:b/>
+          <w:bCs/>
+          <w:color w:val="538135" w:themeColor="accent6" w:themeShade="BF"/>
+        </w:rPr>
+        <w:t>5: Assertion</w:t>
+      </w:r>
+      <w:r>
+        <w:rPr>
+          <w:b/>
+          <w:bCs/>
+          <w:color w:val="538135" w:themeColor="accent6" w:themeShade="BF"/>
+        </w:rPr>
+        <w:t>s</w:t>
       </w:r>
     </w:p>
     <w:p>
@@ -1534,13 +1678,31 @@
       <w:r>
         <w:t xml:space="preserve">             eq, contain, include, exist, </w:t>
       </w:r>
+      <w:proofErr w:type="spellStart"/>
       <w:proofErr w:type="gramStart"/>
       <w:r>
         <w:t>have.length</w:t>
       </w:r>
+      <w:proofErr w:type="spellEnd"/>
       <w:proofErr w:type="gramEnd"/>
       <w:r>
-        <w:t>, have.value etc…</w:t>
+        <w:t xml:space="preserve">, </w:t>
+      </w:r>
+      <w:proofErr w:type="spellStart"/>
+      <w:r>
+        <w:t>have.value</w:t>
+      </w:r>
+      <w:proofErr w:type="spellEnd"/>
+      <w:r>
+        <w:t xml:space="preserve"> </w:t>
+      </w:r>
+      <w:proofErr w:type="spellStart"/>
+      <w:r>
+        <w:t>etc</w:t>
+      </w:r>
+      <w:proofErr w:type="spellEnd"/>
+      <w:r>
+        <w:t>…</w:t>
       </w:r>
     </w:p>
     <w:p>
@@ -1576,6 +1738,90 @@
       <w:r>
         <w:t xml:space="preserve"> – In TDD approach</w:t>
       </w:r>
+    </w:p>
+    <w:p/>
+    <w:p>
+      <w:pPr>
+        <w:rPr>
+          <w:b/>
+          <w:bCs/>
+          <w:color w:val="538135" w:themeColor="accent6" w:themeShade="BF"/>
+        </w:rPr>
+      </w:pPr>
+      <w:r>
+        <w:rPr>
+          <w:b/>
+          <w:bCs/>
+          <w:color w:val="538135" w:themeColor="accent6" w:themeShade="BF"/>
+        </w:rPr>
+        <w:t xml:space="preserve">Part 6: </w:t>
+      </w:r>
+      <w:r>
+        <w:rPr>
+          <w:b/>
+          <w:bCs/>
+          <w:color w:val="538135" w:themeColor="accent6" w:themeShade="BF"/>
+        </w:rPr>
+        <w:t>|Folder Structure | IntelliSense Auto Suggestions</w:t>
+      </w:r>
+    </w:p>
+    <w:p>
+      <w:pPr>
+        <w:rPr>
+          <w:b/>
+          <w:bCs/>
+          <w:color w:val="538135" w:themeColor="accent6" w:themeShade="BF"/>
+        </w:rPr>
+      </w:pPr>
+      <w:r>
+        <w:rPr>
+          <w:noProof/>
+        </w:rPr>
+        <w:drawing>
+          <wp:inline distT="0" distB="0" distL="0" distR="0" wp14:anchorId="14331A9F" wp14:editId="0790F57F">
+            <wp:extent cx="5753100" cy="3390900"/>
+            <wp:effectExtent l="0" t="0" r="0" b="0"/>
+            <wp:docPr id="1444267066" name="Picture 1"/>
+            <wp:cNvGraphicFramePr>
+              <a:graphicFrameLocks xmlns:a="http://schemas.openxmlformats.org/drawingml/2006/main" noChangeAspect="1"/>
+            </wp:cNvGraphicFramePr>
+            <a:graphic xmlns:a="http://schemas.openxmlformats.org/drawingml/2006/main">
+              <a:graphicData uri="http://schemas.openxmlformats.org/drawingml/2006/picture">
+                <pic:pic xmlns:pic="http://schemas.openxmlformats.org/drawingml/2006/picture">
+                  <pic:nvPicPr>
+                    <pic:cNvPr id="1444267066" name=""/>
+                    <pic:cNvPicPr/>
+                  </pic:nvPicPr>
+                  <pic:blipFill>
+                    <a:blip r:embed="rId5"/>
+                    <a:stretch>
+                      <a:fillRect/>
+                    </a:stretch>
+                  </pic:blipFill>
+                  <pic:spPr>
+                    <a:xfrm>
+                      <a:off x="0" y="0"/>
+                      <a:ext cx="5753100" cy="3390900"/>
+                    </a:xfrm>
+                    <a:prstGeom prst="rect">
+                      <a:avLst/>
+                    </a:prstGeom>
+                  </pic:spPr>
+                </pic:pic>
+              </a:graphicData>
+            </a:graphic>
+          </wp:inline>
+        </w:drawing>
+      </w:r>
+    </w:p>
+    <w:p>
+      <w:pPr>
+        <w:rPr>
+          <w:b/>
+          <w:bCs/>
+          <w:color w:val="538135" w:themeColor="accent6" w:themeShade="BF"/>
+        </w:rPr>
+      </w:pPr>
     </w:p>
     <w:p>
       <w:pPr>
@@ -2308,7 +2554,6 @@
   <w:style w:type="character" w:default="1" w:styleId="DefaultParagraphFont">
     <w:name w:val="Default Paragraph Font"/>
     <w:uiPriority w:val="1"/>
-    <w:semiHidden/>
     <w:unhideWhenUsed/>
   </w:style>
   <w:style w:type="table" w:default="1" w:styleId="TableNormal">

</xml_diff>